<commit_message>
fix(dispatch): fix document auto-generation upload and standardize template placeholders
</commit_message>
<xml_diff>
--- a/public/templates/Driver Travel Order.docx
+++ b/public/templates/Driver Travel Order.docx
@@ -92,7 +92,7 @@
               </wp:anchor>
             </w:drawing>
           </mc:Choice>
-          <mc:Fallback xmlns:oel="http://schemas.microsoft.com/office/2019/extlst" xmlns:w16du="http://schemas.microsoft.com/office/word/2023/wordml/word16du" xmlns:w16sdtfl="http://schemas.microsoft.com/office/word/2024/wordml/sdtformatlock">
+          <mc:Fallback xmlns:w16sdtfl="http://schemas.microsoft.com/office/word/2024/wordml/sdtformatlock" xmlns:w16du="http://schemas.microsoft.com/office/word/2023/wordml/word16du" xmlns:oel="http://schemas.microsoft.com/office/2019/extlst">
             <w:pict>
               <v:shape w14:anchorId="3A22B710" id="Graphic 3" o:spid="_x0000_s1026" style="position:absolute;margin-left:106.6pt;margin-top:15.9pt;width:129.75pt;height:55.5pt;z-index:-15785984;visibility:visible;mso-wrap-style:square;mso-wrap-distance-left:9pt;mso-wrap-distance-top:0;mso-wrap-distance-right:9pt;mso-wrap-distance-bottom:0;mso-position-horizontal:absolute;mso-position-horizontal-relative:text;mso-position-vertical:absolute;mso-position-vertical-relative:text;v-text-anchor:top" coordsize="1647825,704850" o:gfxdata="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" path="m,704621r1647570,l1647570,,,,,704621xe" filled="f" strokecolor="white" strokeweight="1pt">
                 <v:path arrowok="t"/>
@@ -224,7 +224,7 @@
               </wp:anchor>
             </w:drawing>
           </mc:Choice>
-          <mc:Fallback xmlns:oel="http://schemas.microsoft.com/office/2019/extlst" xmlns:w16du="http://schemas.microsoft.com/office/word/2023/wordml/word16du" xmlns:w16sdtfl="http://schemas.microsoft.com/office/word/2024/wordml/sdtformatlock">
+          <mc:Fallback xmlns:w16sdtfl="http://schemas.microsoft.com/office/word/2024/wordml/sdtformatlock" xmlns:w16du="http://schemas.microsoft.com/office/word/2023/wordml/word16du" xmlns:oel="http://schemas.microsoft.com/office/2019/extlst">
             <w:pict>
               <v:shapetype w14:anchorId="02CD4356" id="_x0000_t32" coordsize="21600,21600" o:spt="32" o:oned="t" path="m,l21600,21600e" filled="f">
                 <v:path arrowok="t" fillok="f" o:connecttype="none"/>
@@ -302,7 +302,7 @@
               </wp:anchor>
             </w:drawing>
           </mc:Choice>
-          <mc:Fallback xmlns:oel="http://schemas.microsoft.com/office/2019/extlst" xmlns:w16du="http://schemas.microsoft.com/office/word/2023/wordml/word16du" xmlns:w16sdtfl="http://schemas.microsoft.com/office/word/2024/wordml/sdtformatlock">
+          <mc:Fallback xmlns:w16sdtfl="http://schemas.microsoft.com/office/word/2024/wordml/sdtformatlock" xmlns:w16du="http://schemas.microsoft.com/office/word/2023/wordml/word16du" xmlns:oel="http://schemas.microsoft.com/office/2019/extlst">
             <w:pict>
               <v:shape w14:anchorId="500DD81E" id="Straight Arrow Connector 12" o:spid="_x0000_s1026" type="#_x0000_t32" style="position:absolute;margin-left:222.15pt;margin-top:11.75pt;width:228pt;height:0;z-index:487532544;visibility:visible;mso-wrap-style:square;mso-width-percent:0;mso-height-percent:0;mso-wrap-distance-left:9pt;mso-wrap-distance-top:0;mso-wrap-distance-right:9pt;mso-wrap-distance-bottom:0;mso-position-horizontal:absolute;mso-position-horizontal-relative:text;mso-position-vertical:absolute;mso-position-vertical-relative:text;mso-width-percent:0;mso-height-percent:0;mso-width-relative:page;mso-height-relative:page" o:gfxdata="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"/>
             </w:pict>
@@ -337,7 +337,16 @@
         <w:t xml:space="preserve"> </w:t>
       </w:r>
       <w:r>
-        <w:t xml:space="preserve">            (Destination)</w:t>
+        <w:t xml:space="preserve">            </w:t>
+      </w:r>
+      <w:r>
+        <w:t>{</w:t>
+      </w:r>
+      <w:r>
+        <w:t>Destination</w:t>
+      </w:r>
+      <w:r>
+        <w:t>}</w:t>
       </w:r>
       <w:r>
         <w:t xml:space="preserve">       </w:t>
@@ -385,7 +394,19 @@
         <w:t xml:space="preserve"> </w:t>
       </w:r>
       <w:r>
-        <w:t xml:space="preserve">    (Travel Date)   _                         </w:t>
+        <w:t xml:space="preserve">    </w:t>
+      </w:r>
+      <w:r>
+        <w:t xml:space="preserve">       {</w:t>
+      </w:r>
+      <w:r>
+        <w:t>Travel Date</w:t>
+      </w:r>
+      <w:r>
+        <w:t>}</w:t>
+      </w:r>
+      <w:r>
+        <w:t xml:space="preserve">   _                         </w:t>
       </w:r>
       <w:r>
         <w:t xml:space="preserve">to </w:t>
@@ -410,7 +431,15 @@
         <w:spacing w:line="360" w:lineRule="auto"/>
       </w:pPr>
       <w:r>
-        <w:t>Purpose of Travel</w:t>
+        <w:t>{</w:t>
+      </w:r>
+      <w:proofErr w:type="spellStart"/>
+      <w:r>
+        <w:t>purpose_of_travel</w:t>
+      </w:r>
+      <w:proofErr w:type="spellEnd"/>
+      <w:r>
+        <w:t>}</w:t>
       </w:r>
     </w:p>
     <w:p>
@@ -559,13 +588,13 @@
         <w:rPr>
           <w:rFonts w:ascii="Arial" w:hAnsi="Arial" w:cs="Arial"/>
         </w:rPr>
-        <w:t xml:space="preserve"> </w:t>
+        <w:t xml:space="preserve">) </w:t>
       </w:r>
       <w:r>
         <w:rPr>
           <w:rFonts w:ascii="Arial" w:hAnsi="Arial" w:cs="Arial"/>
         </w:rPr>
-        <w:t>) day</w:t>
+        <w:t xml:space="preserve"> day</w:t>
       </w:r>
       <w:r>
         <w:rPr>
@@ -1026,7 +1055,7 @@
             </wp:anchor>
           </w:drawing>
         </mc:Choice>
-        <mc:Fallback xmlns:oel="http://schemas.microsoft.com/office/2019/extlst" xmlns:w16du="http://schemas.microsoft.com/office/word/2023/wordml/word16du" xmlns:w16sdtfl="http://schemas.microsoft.com/office/word/2024/wordml/sdtformatlock">
+        <mc:Fallback xmlns:w16sdtfl="http://schemas.microsoft.com/office/word/2024/wordml/sdtformatlock" xmlns:w16du="http://schemas.microsoft.com/office/word/2023/wordml/word16du" xmlns:oel="http://schemas.microsoft.com/office/2019/extlst">
           <w:pict>
             <v:shape w14:anchorId="42F743B5" id="Graphic 11" o:spid="_x0000_s1026" style="position:absolute;margin-left:0;margin-top:-3.55pt;width:7in;height:3.55pt;z-index:-251652096;visibility:visible;mso-wrap-style:square;mso-width-percent:0;mso-height-percent:0;mso-wrap-distance-left:0;mso-wrap-distance-top:0;mso-wrap-distance-right:0;mso-wrap-distance-bottom:0;mso-position-horizontal:center;mso-position-horizontal-relative:margin;mso-position-vertical:absolute;mso-position-vertical-relative:text;mso-width-percent:0;mso-height-percent:0;mso-width-relative:margin;mso-height-relative:margin;v-text-anchor:top" coordsize="5635625,45085" o:gfxdata="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" path="m,l5635193,e" filled="f" strokeweight=".144mm">
               <v:path arrowok="t"/>

</xml_diff>

<commit_message>
fix(templates): update all driver name placeholders to curly braces syntax
</commit_message>
<xml_diff>
--- a/public/templates/Driver Travel Order.docx
+++ b/public/templates/Driver Travel Order.docx
@@ -92,7 +92,7 @@
               </wp:anchor>
             </w:drawing>
           </mc:Choice>
-          <mc:Fallback xmlns:w16sdtfl="http://schemas.microsoft.com/office/word/2024/wordml/sdtformatlock" xmlns:w16du="http://schemas.microsoft.com/office/word/2023/wordml/word16du" xmlns:oel="http://schemas.microsoft.com/office/2019/extlst">
+          <mc:Fallback xmlns:oel="http://schemas.microsoft.com/office/2019/extlst" xmlns:w16du="http://schemas.microsoft.com/office/word/2023/wordml/word16du" xmlns:w16sdtfl="http://schemas.microsoft.com/office/word/2024/wordml/sdtformatlock">
             <w:pict>
               <v:shape w14:anchorId="3A22B710" id="Graphic 3" o:spid="_x0000_s1026" style="position:absolute;margin-left:106.6pt;margin-top:15.9pt;width:129.75pt;height:55.5pt;z-index:-15785984;visibility:visible;mso-wrap-style:square;mso-wrap-distance-left:9pt;mso-wrap-distance-top:0;mso-wrap-distance-right:9pt;mso-wrap-distance-bottom:0;mso-position-horizontal:absolute;mso-position-horizontal-relative:text;mso-position-vertical:absolute;mso-position-vertical-relative:text;v-text-anchor:top" coordsize="1647825,704850" o:gfxdata="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" path="m,704621r1647570,l1647570,,,,,704621xe" filled="f" strokecolor="white" strokeweight="1pt">
                 <v:path arrowok="t"/>
@@ -137,7 +137,7 @@
         <w:t xml:space="preserve">         </w:t>
       </w:r>
       <w:r>
-        <w:t>(Driver Full Name)</w:t>
+        <w:t>{driver_name}</w:t>
       </w:r>
     </w:p>
     <w:p>
@@ -224,7 +224,7 @@
               </wp:anchor>
             </w:drawing>
           </mc:Choice>
-          <mc:Fallback xmlns:w16sdtfl="http://schemas.microsoft.com/office/word/2024/wordml/sdtformatlock" xmlns:w16du="http://schemas.microsoft.com/office/word/2023/wordml/word16du" xmlns:oel="http://schemas.microsoft.com/office/2019/extlst">
+          <mc:Fallback xmlns:oel="http://schemas.microsoft.com/office/2019/extlst" xmlns:w16du="http://schemas.microsoft.com/office/word/2023/wordml/word16du" xmlns:w16sdtfl="http://schemas.microsoft.com/office/word/2024/wordml/sdtformatlock">
             <w:pict>
               <v:shapetype w14:anchorId="02CD4356" id="_x0000_t32" coordsize="21600,21600" o:spt="32" o:oned="t" path="m,l21600,21600e" filled="f">
                 <v:path arrowok="t" fillok="f" o:connecttype="none"/>
@@ -302,7 +302,7 @@
               </wp:anchor>
             </w:drawing>
           </mc:Choice>
-          <mc:Fallback xmlns:w16sdtfl="http://schemas.microsoft.com/office/word/2024/wordml/sdtformatlock" xmlns:w16du="http://schemas.microsoft.com/office/word/2023/wordml/word16du" xmlns:oel="http://schemas.microsoft.com/office/2019/extlst">
+          <mc:Fallback xmlns:oel="http://schemas.microsoft.com/office/2019/extlst" xmlns:w16du="http://schemas.microsoft.com/office/word/2023/wordml/word16du" xmlns:w16sdtfl="http://schemas.microsoft.com/office/word/2024/wordml/sdtformatlock">
             <w:pict>
               <v:shape w14:anchorId="500DD81E" id="Straight Arrow Connector 12" o:spid="_x0000_s1026" type="#_x0000_t32" style="position:absolute;margin-left:222.15pt;margin-top:11.75pt;width:228pt;height:0;z-index:487532544;visibility:visible;mso-wrap-style:square;mso-width-percent:0;mso-height-percent:0;mso-wrap-distance-left:9pt;mso-wrap-distance-top:0;mso-wrap-distance-right:9pt;mso-wrap-distance-bottom:0;mso-position-horizontal:absolute;mso-position-horizontal-relative:text;mso-position-vertical:absolute;mso-position-vertical-relative:text;mso-width-percent:0;mso-height-percent:0;mso-width-relative:page;mso-height-relative:page" o:gfxdata="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"/>
             </w:pict>
@@ -431,15 +431,7 @@
         <w:spacing w:line="360" w:lineRule="auto"/>
       </w:pPr>
       <w:r>
-        <w:t>{</w:t>
-      </w:r>
-      <w:proofErr w:type="spellStart"/>
-      <w:r>
-        <w:t>purpose_of_travel</w:t>
-      </w:r>
-      <w:proofErr w:type="spellEnd"/>
-      <w:r>
-        <w:t>}</w:t>
+        <w:t>{purpose_of_travel}</w:t>
       </w:r>
     </w:p>
     <w:p>
@@ -1055,7 +1047,7 @@
             </wp:anchor>
           </w:drawing>
         </mc:Choice>
-        <mc:Fallback xmlns:w16sdtfl="http://schemas.microsoft.com/office/word/2024/wordml/sdtformatlock" xmlns:w16du="http://schemas.microsoft.com/office/word/2023/wordml/word16du" xmlns:oel="http://schemas.microsoft.com/office/2019/extlst">
+        <mc:Fallback xmlns:oel="http://schemas.microsoft.com/office/2019/extlst" xmlns:w16du="http://schemas.microsoft.com/office/word/2023/wordml/word16du" xmlns:w16sdtfl="http://schemas.microsoft.com/office/word/2024/wordml/sdtformatlock">
           <w:pict>
             <v:shape w14:anchorId="42F743B5" id="Graphic 11" o:spid="_x0000_s1026" style="position:absolute;margin-left:0;margin-top:-3.55pt;width:7in;height:3.55pt;z-index:-251652096;visibility:visible;mso-wrap-style:square;mso-width-percent:0;mso-height-percent:0;mso-wrap-distance-left:0;mso-wrap-distance-top:0;mso-wrap-distance-right:0;mso-wrap-distance-bottom:0;mso-position-horizontal:center;mso-position-horizontal-relative:margin;mso-position-vertical:absolute;mso-position-vertical-relative:text;mso-width-percent:0;mso-height-percent:0;mso-width-relative:margin;mso-height-relative:margin;v-text-anchor:top" coordsize="5635625,45085" o:gfxdata="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" path="m,l5635193,e" filled="f" strokeweight=".144mm">
               <v:path arrowok="t"/>

</xml_diff>